<commit_message>
Repoint Assignment 1 links at biometry_course and re-render the examples
Assignment_1.docx had five links to the retired Statistical_ecology_course repo,
and it goes out to students this week. Example.Rmd already pointed at the current
repo but its rendered html, docx and pdf were stale, so all three were
regenerated.

Also commits the updated Lecture 5 exports.

Co-Authored-By: Claude Opus 5 <noreply@anthropic.com>
</commit_message>
<xml_diff>
--- a/assignments/Assignment_1.docx
+++ b/assignments/Assignment_1.docx
@@ -339,7 +339,7 @@
             <w:u w:val="single"/>
             <w:rtl w:val="0"/>
           </w:rPr>
-          <w:t xml:space="preserve">https://github.com/bmaitner/Statistical_ecology_course/blob/main/example_R_markdown/Example.Rmd</w:t>
+          <w:t xml:space="preserve">https://github.com/bmaitner/biometry_course/blob/main/example_R_markdown/Example.Rmd</w:t>
         </w:r>
       </w:hyperlink>
       <w:r>
@@ -399,7 +399,7 @@
             <w:u w:val="single"/>
             <w:rtl w:val="0"/>
           </w:rPr>
-          <w:t xml:space="preserve">https://github.com/bmaitner/Statistical_ecology_course/blob/main/example_R_markdown/Example.pdf</w:t>
+          <w:t xml:space="preserve">https://github.com/bmaitner/biometry_course/blob/main/example_R_markdown/Example.pdf</w:t>
         </w:r>
       </w:hyperlink>
       <w:r>
@@ -438,7 +438,7 @@
             <w:u w:val="single"/>
             <w:rtl w:val="0"/>
           </w:rPr>
-          <w:t xml:space="preserve">https://github.com/bmaitner/Statistical_ecology_course/raw/refs/heads/main/example_R_markdown/Example.docx</w:t>
+          <w:t xml:space="preserve">https://github.com/bmaitner/biometry_course/raw/refs/heads/main/example_R_markdown/Example.docx</w:t>
         </w:r>
       </w:hyperlink>
       <w:r>
@@ -477,7 +477,7 @@
             <w:u w:val="single"/>
             <w:rtl w:val="0"/>
           </w:rPr>
-          <w:t xml:space="preserve">https://github.com/bmaitner/Statistical_ecology_course/raw/refs/heads/main/example_R_markdown/Example.html</w:t>
+          <w:t xml:space="preserve">https://github.com/bmaitner/biometry_course/raw/refs/heads/main/example_R_markdown/Example.html</w:t>
         </w:r>
       </w:hyperlink>
       <w:r>
@@ -552,7 +552,7 @@
             <w:u w:val="single"/>
             <w:rtl w:val="0"/>
           </w:rPr>
-          <w:t xml:space="preserve">https://github.com/bmaitner/Statistical_ecology_course/blob/main/example_R_commented/Example.R</w:t>
+          <w:t xml:space="preserve">https://github.com/bmaitner/biometry_course/blob/main/example_R_commented/Example.R</w:t>
         </w:r>
       </w:hyperlink>
       <w:r>

</xml_diff>